<commit_message>
Update 6-Audio For 2D Project.docx
</commit_message>
<xml_diff>
--- a/Unit 5 - Audio/6-Audio For 2D Project.docx
+++ b/Unit 5 - Audio/6-Audio For 2D Project.docx
@@ -1,6 +1,6 @@
 
 <file path=word/document.xml><?xml version="1.0" encoding="utf-8"?>
-<w:document xmlns:wpc="http://schemas.microsoft.com/office/word/2010/wordprocessingCanvas" xmlns:cx="http://schemas.microsoft.com/office/drawing/2014/chartex" xmlns:cx1="http://schemas.microsoft.com/office/drawing/2015/9/8/chartex" xmlns:cx2="http://schemas.microsoft.com/office/drawing/2015/10/21/chartex" xmlns:cx3="http://schemas.microsoft.com/office/drawing/2016/5/9/chartex" xmlns:cx4="http://schemas.microsoft.com/office/drawing/2016/5/10/chartex" xmlns:cx5="http://schemas.microsoft.com/office/drawing/2016/5/11/chartex" xmlns:cx6="http://schemas.microsoft.com/office/drawing/2016/5/12/chartex" xmlns:cx7="http://schemas.microsoft.com/office/drawing/2016/5/13/chartex" xmlns:cx8="http://schemas.microsoft.com/office/drawing/2016/5/14/chartex" xmlns:mc="http://schemas.openxmlformats.org/markup-compatibility/2006" xmlns:aink="http://schemas.microsoft.com/office/drawing/2016/ink" xmlns:am3d="http://schemas.microsoft.com/office/drawing/2017/model3d" xmlns:o="urn:schemas-microsoft-com:office:office" xmlns:oel="http://schemas.microsoft.com/office/2019/extlst" xmlns:r="http://schemas.openxmlformats.org/officeDocument/2006/relationships" xmlns:m="http://schemas.openxmlformats.org/officeDocument/2006/math" xmlns:v="urn:schemas-microsoft-com:vml" xmlns:wp14="http://schemas.microsoft.com/office/word/2010/wordprocessingDrawing" xmlns:wp="http://schemas.openxmlformats.org/drawingml/2006/wordprocessingDrawing" xmlns:w10="urn:schemas-microsoft-com:office:word" xmlns:w="http://schemas.openxmlformats.org/wordprocessingml/2006/main" xmlns:w14="http://schemas.microsoft.com/office/word/2010/wordml" xmlns:w15="http://schemas.microsoft.com/office/word/2012/wordml" xmlns:w16cei="http://schemas.microsoft.com/office/word/2026/wordml/cei" xmlns:w16cex="http://schemas.microsoft.com/office/word/2018/wordml/cex" xmlns:w16cid="http://schemas.microsoft.com/office/word/2016/wordml/cid" xmlns:w16="http://schemas.microsoft.com/office/word/2018/wordml" xmlns:w16du="http://schemas.microsoft.com/office/word/2023/wordml/word16du" xmlns:w16sdtdh="http://schemas.microsoft.com/office/word/2020/wordml/sdtdatahash" xmlns:w16sdtfl="http://schemas.microsoft.com/office/word/2024/wordml/sdtformatlock" xmlns:w16se="http://schemas.microsoft.com/office/word/2015/wordml/symex" xmlns:wpg="http://schemas.microsoft.com/office/word/2010/wordprocessingGroup" xmlns:wpi="http://schemas.microsoft.com/office/word/2010/wordprocessingInk" xmlns:wne="http://schemas.microsoft.com/office/word/2006/wordml" xmlns:wps="http://schemas.microsoft.com/office/word/2010/wordprocessingShape" mc:Ignorable="w14 w15 w16se w16cid w16 w16cex w16sdtdh w16sdtfl w16du wp14">
+<w:document xmlns:wpc="http://schemas.microsoft.com/office/word/2010/wordprocessingCanvas" xmlns:cx="http://schemas.microsoft.com/office/drawing/2014/chartex" xmlns:cx1="http://schemas.microsoft.com/office/drawing/2015/9/8/chartex" xmlns:cx2="http://schemas.microsoft.com/office/drawing/2015/10/21/chartex" xmlns:cx3="http://schemas.microsoft.com/office/drawing/2016/5/9/chartex" xmlns:cx4="http://schemas.microsoft.com/office/drawing/2016/5/10/chartex" xmlns:cx5="http://schemas.microsoft.com/office/drawing/2016/5/11/chartex" xmlns:cx6="http://schemas.microsoft.com/office/drawing/2016/5/12/chartex" xmlns:cx7="http://schemas.microsoft.com/office/drawing/2016/5/13/chartex" xmlns:cx8="http://schemas.microsoft.com/office/drawing/2016/5/14/chartex" xmlns:mc="http://schemas.openxmlformats.org/markup-compatibility/2006" xmlns:aink="http://schemas.microsoft.com/office/drawing/2016/ink" xmlns:am3d="http://schemas.microsoft.com/office/drawing/2017/model3d" xmlns:o="urn:schemas-microsoft-com:office:office" xmlns:oel="http://schemas.microsoft.com/office/2019/extlst" xmlns:r="http://schemas.openxmlformats.org/officeDocument/2006/relationships" xmlns:m="http://schemas.openxmlformats.org/officeDocument/2006/math" xmlns:v="urn:schemas-microsoft-com:vml" xmlns:wp14="http://schemas.microsoft.com/office/word/2010/wordprocessingDrawing" xmlns:wp="http://schemas.openxmlformats.org/drawingml/2006/wordprocessingDrawing" xmlns:w10="urn:schemas-microsoft-com:office:word" xmlns:w="http://schemas.openxmlformats.org/wordprocessingml/2006/main" xmlns:w14="http://schemas.microsoft.com/office/word/2010/wordml" xmlns:w15="http://schemas.microsoft.com/office/word/2012/wordml" xmlns:w16cex="http://schemas.microsoft.com/office/word/2018/wordml/cex" xmlns:w16cid="http://schemas.microsoft.com/office/word/2016/wordml/cid" xmlns:w16="http://schemas.microsoft.com/office/word/2018/wordml" xmlns:w16du="http://schemas.microsoft.com/office/word/2023/wordml/word16du" xmlns:w16sdtdh="http://schemas.microsoft.com/office/word/2020/wordml/sdtdatahash" xmlns:w16sdtfl="http://schemas.microsoft.com/office/word/2024/wordml/sdtformatlock" xmlns:w16se="http://schemas.microsoft.com/office/word/2015/wordml/symex" xmlns:wpg="http://schemas.microsoft.com/office/word/2010/wordprocessingGroup" xmlns:wpi="http://schemas.microsoft.com/office/word/2010/wordprocessingInk" xmlns:wne="http://schemas.microsoft.com/office/word/2006/wordml" xmlns:wps="http://schemas.microsoft.com/office/word/2010/wordprocessingShape" mc:Ignorable="w14 w15 w16se w16cid w16 w16cex w16sdtdh w16sdtfl w16du wp14">
   <w:body>
     <w:p>
       <w:pPr>
@@ -19,25 +19,25 @@
     </w:p>
     <w:p>
       <w:r>
-        <w:rPr>
-          <w:b/>
-          <w:bCs/>
-        </w:rPr>
-        <w:t>Q&amp;A (0)</w:t>
-      </w:r>
-    </w:p>
-    <w:p>
-      <w:r>
         <w:t>You’ve created audio for 3D projects, including implementing spatial audio for environmental sounds, dynamic footsteps triggered by animation events, and reverb zones to simulate enclosed spaces.</w:t>
       </w:r>
     </w:p>
     <w:p>
       <w:r>
-        <w:t>In this tutorial, you’ll see those concepts applied in a 2D context. You'll explore a 2D version of a similar scene with comparable audio incorporated, and you’ll discover how audio functionality remains similar or differs in a 2D project.</w:t>
-      </w:r>
-    </w:p>
-    <w:p>
-      <w:r>
+        <w:t xml:space="preserve">In this </w:t>
+      </w:r>
+      <w:r>
+        <w:t>lab</w:t>
+      </w:r>
+      <w:r>
+        <w:t>, you’ll see those concepts applied in a 2D context. You'll explore a 2D version of a similar scene with comparable audio incorporated, and you’ll discover how audio functionality remains similar or differs in a 2D project.</w:t>
+      </w:r>
+    </w:p>
+    <w:p>
+      <w:r>
+        <w:rPr>
+          <w:noProof/>
+        </w:rPr>
         <w:drawing>
           <wp:inline distT="0" distB="0" distL="0" distR="0" wp14:anchorId="6122EEEE" wp14:editId="5C43FA08">
             <wp:extent cx="5943600" cy="3343275"/>
@@ -110,15 +110,6 @@
     </w:p>
     <w:p>
       <w:r>
-        <w:rPr>
-          <w:b/>
-          <w:bCs/>
-        </w:rPr>
-        <w:t>Q&amp;A (0)</w:t>
-      </w:r>
-    </w:p>
-    <w:p>
-      <w:r>
         <w:t>In this step, you'll open the </w:t>
       </w:r>
       <w:r>
@@ -134,6 +125,9 @@
     </w:p>
     <w:p>
       <w:r>
+        <w:rPr>
+          <w:noProof/>
+        </w:rPr>
         <w:lastRenderedPageBreak/>
         <w:drawing>
           <wp:inline distT="0" distB="0" distL="0" distR="0" wp14:anchorId="143502EB" wp14:editId="5DFA094F">
@@ -186,11 +180,6 @@
       </w:r>
     </w:p>
     <w:p>
-      <w:r>
-        <w:t>Play Video</w:t>
-      </w:r>
-    </w:p>
-    <w:p>
       <w:pPr>
         <w:rPr>
           <w:b/>
@@ -520,22 +509,22 @@
         </w:numPr>
       </w:pPr>
       <w:r>
+        <w:t>Exit Play</w:t>
+      </w:r>
+      <w:r>
+        <w:rPr>
+          <w:b/>
+          <w:bCs/>
+        </w:rPr>
+        <w:t> </w:t>
+      </w:r>
+      <w:r>
+        <w:t>mode when you’re done.</w:t>
+      </w:r>
+    </w:p>
+    <w:p>
+      <w:r>
         <w:lastRenderedPageBreak/>
-        <w:t>Exit Play</w:t>
-      </w:r>
-      <w:r>
-        <w:rPr>
-          <w:b/>
-          <w:bCs/>
-        </w:rPr>
-        <w:t> </w:t>
-      </w:r>
-      <w:r>
-        <w:t>mode when you’re done.</w:t>
-      </w:r>
-    </w:p>
-    <w:p>
-      <w:r>
         <w:t>Mark step incomplete</w:t>
       </w:r>
     </w:p>
@@ -552,15 +541,6 @@
           <w:bCs/>
         </w:rPr>
         <w:t>3. Explore the 2D vs 3D implementation</w:t>
-      </w:r>
-    </w:p>
-    <w:p>
-      <w:r>
-        <w:rPr>
-          <w:b/>
-          <w:bCs/>
-        </w:rPr>
-        <w:t>Q&amp;A (0)</w:t>
       </w:r>
     </w:p>
     <w:p>
@@ -613,7 +593,6 @@
       <w:r>
         <w:t>Check the </w:t>
       </w:r>
-      <w:proofErr w:type="spellStart"/>
       <w:r>
         <w:rPr>
           <w:b/>
@@ -621,17 +600,8 @@
         </w:rPr>
         <w:t>Audio_Waterfall</w:t>
       </w:r>
-      <w:proofErr w:type="spellEnd"/>
-      <w:r>
-        <w:t> </w:t>
-      </w:r>
-      <w:proofErr w:type="spellStart"/>
-      <w:r>
-        <w:t>GameObject's</w:t>
-      </w:r>
-      <w:proofErr w:type="spellEnd"/>
-      <w:r>
-        <w:t> </w:t>
+      <w:r>
+        <w:t> GameObject's </w:t>
       </w:r>
       <w:r>
         <w:rPr>
@@ -666,6 +636,9 @@
     </w:p>
     <w:p>
       <w:r>
+        <w:rPr>
+          <w:noProof/>
+        </w:rPr>
         <w:lastRenderedPageBreak/>
         <w:drawing>
           <wp:inline distT="0" distB="0" distL="0" distR="0" wp14:anchorId="50BDBEC5" wp14:editId="42F96507">
@@ -785,6 +758,9 @@
     </w:p>
     <w:p>
       <w:r>
+        <w:rPr>
+          <w:noProof/>
+        </w:rPr>
         <w:lastRenderedPageBreak/>
         <w:drawing>
           <wp:inline distT="0" distB="0" distL="0" distR="0" wp14:anchorId="1A4C7DC2" wp14:editId="2621139C">
@@ -855,21 +831,12 @@
       <w:r>
         <w:t>While 2D animations can use events to trigger sounds just like in the 3D project, in this project they do so with </w:t>
       </w:r>
-      <w:proofErr w:type="spellStart"/>
-      <w:r>
-        <w:rPr>
-          <w:b/>
-          <w:bCs/>
-        </w:rPr>
-        <w:t>spritesheet</w:t>
-      </w:r>
-      <w:proofErr w:type="spellEnd"/>
-      <w:r>
-        <w:rPr>
-          <w:b/>
-          <w:bCs/>
-        </w:rPr>
-        <w:t xml:space="preserve"> animations</w:t>
+      <w:r>
+        <w:rPr>
+          <w:b/>
+          <w:bCs/>
+        </w:rPr>
+        <w:t>spritesheet animations</w:t>
       </w:r>
       <w:r>
         <w:t>.</w:t>
@@ -977,7 +944,6 @@
       <w:r>
         <w:t>along the top of the timeline and notice that </w:t>
       </w:r>
-      <w:proofErr w:type="spellStart"/>
       <w:r>
         <w:rPr>
           <w:b/>
@@ -985,7 +951,6 @@
         </w:rPr>
         <w:t>PlayStep</w:t>
       </w:r>
-      <w:proofErr w:type="spellEnd"/>
       <w:r>
         <w:t> is listed as the </w:t>
       </w:r>
@@ -1010,7 +975,6 @@
       <w:r>
         <w:t>If you’re interested, open the </w:t>
       </w:r>
-      <w:proofErr w:type="spellStart"/>
       <w:r>
         <w:rPr>
           <w:b/>
@@ -1018,11 +982,9 @@
         </w:rPr>
         <w:t>FootstepManager</w:t>
       </w:r>
-      <w:proofErr w:type="spellEnd"/>
       <w:r>
         <w:t> script to see where the </w:t>
       </w:r>
-      <w:proofErr w:type="spellStart"/>
       <w:r>
         <w:rPr>
           <w:b/>
@@ -1030,13 +992,15 @@
         </w:rPr>
         <w:t>PlayStep</w:t>
       </w:r>
-      <w:proofErr w:type="spellEnd"/>
       <w:r>
         <w:t> function is written.</w:t>
       </w:r>
     </w:p>
     <w:p>
       <w:r>
+        <w:rPr>
+          <w:noProof/>
+        </w:rPr>
         <w:lastRenderedPageBreak/>
         <w:drawing>
           <wp:inline distT="0" distB="0" distL="0" distR="0" wp14:anchorId="03814E6D" wp14:editId="69AD5B5E">
@@ -1089,16 +1053,6 @@
       </w:r>
     </w:p>
     <w:p>
-      <w:r>
-        <w:t>Play Video</w:t>
-      </w:r>
-    </w:p>
-    <w:p>
-      <w:r>
-        <w:t>Mark step incomplete</w:t>
-      </w:r>
-    </w:p>
-    <w:p>
       <w:pPr>
         <w:rPr>
           <w:b/>
@@ -1111,15 +1065,6 @@
           <w:bCs/>
         </w:rPr>
         <w:t>4. Next steps</w:t>
-      </w:r>
-    </w:p>
-    <w:p>
-      <w:r>
-        <w:rPr>
-          <w:b/>
-          <w:bCs/>
-        </w:rPr>
-        <w:t>Q&amp;A (0)</w:t>
       </w:r>
     </w:p>
     <w:p>
@@ -1144,7 +1089,7 @@
 </file>
 
 <file path=word/numbering.xml><?xml version="1.0" encoding="utf-8"?>
-<w:numbering xmlns:wpc="http://schemas.microsoft.com/office/word/2010/wordprocessingCanvas" xmlns:cx="http://schemas.microsoft.com/office/drawing/2014/chartex" xmlns:cx1="http://schemas.microsoft.com/office/drawing/2015/9/8/chartex" xmlns:cx2="http://schemas.microsoft.com/office/drawing/2015/10/21/chartex" xmlns:cx3="http://schemas.microsoft.com/office/drawing/2016/5/9/chartex" xmlns:cx4="http://schemas.microsoft.com/office/drawing/2016/5/10/chartex" xmlns:cx5="http://schemas.microsoft.com/office/drawing/2016/5/11/chartex" xmlns:cx6="http://schemas.microsoft.com/office/drawing/2016/5/12/chartex" xmlns:cx7="http://schemas.microsoft.com/office/drawing/2016/5/13/chartex" xmlns:cx8="http://schemas.microsoft.com/office/drawing/2016/5/14/chartex" xmlns:mc="http://schemas.openxmlformats.org/markup-compatibility/2006" xmlns:aink="http://schemas.microsoft.com/office/drawing/2016/ink" xmlns:am3d="http://schemas.microsoft.com/office/drawing/2017/model3d" xmlns:o="urn:schemas-microsoft-com:office:office" xmlns:oel="http://schemas.microsoft.com/office/2019/extlst" xmlns:r="http://schemas.openxmlformats.org/officeDocument/2006/relationships" xmlns:m="http://schemas.openxmlformats.org/officeDocument/2006/math" xmlns:v="urn:schemas-microsoft-com:vml" xmlns:wp14="http://schemas.microsoft.com/office/word/2010/wordprocessingDrawing" xmlns:wp="http://schemas.openxmlformats.org/drawingml/2006/wordprocessingDrawing" xmlns:w10="urn:schemas-microsoft-com:office:word" xmlns:w="http://schemas.openxmlformats.org/wordprocessingml/2006/main" xmlns:w14="http://schemas.microsoft.com/office/word/2010/wordml" xmlns:w15="http://schemas.microsoft.com/office/word/2012/wordml" xmlns:w16cei="http://schemas.microsoft.com/office/word/2026/wordml/cei" xmlns:w16cex="http://schemas.microsoft.com/office/word/2018/wordml/cex" xmlns:w16cid="http://schemas.microsoft.com/office/word/2016/wordml/cid" xmlns:w16="http://schemas.microsoft.com/office/word/2018/wordml" xmlns:w16du="http://schemas.microsoft.com/office/word/2023/wordml/word16du" xmlns:w16sdtdh="http://schemas.microsoft.com/office/word/2020/wordml/sdtdatahash" xmlns:w16sdtfl="http://schemas.microsoft.com/office/word/2024/wordml/sdtformatlock" xmlns:w16se="http://schemas.microsoft.com/office/word/2015/wordml/symex" xmlns:wpg="http://schemas.microsoft.com/office/word/2010/wordprocessingGroup" xmlns:wpi="http://schemas.microsoft.com/office/word/2010/wordprocessingInk" xmlns:wne="http://schemas.microsoft.com/office/word/2006/wordml" xmlns:wps="http://schemas.microsoft.com/office/word/2010/wordprocessingShape" mc:Ignorable="w14 w15 w16se w16cid w16 w16cex w16sdtdh w16sdtfl w16du wp14">
+<w:numbering xmlns:wpc="http://schemas.microsoft.com/office/word/2010/wordprocessingCanvas" xmlns:cx="http://schemas.microsoft.com/office/drawing/2014/chartex" xmlns:cx1="http://schemas.microsoft.com/office/drawing/2015/9/8/chartex" xmlns:cx2="http://schemas.microsoft.com/office/drawing/2015/10/21/chartex" xmlns:cx3="http://schemas.microsoft.com/office/drawing/2016/5/9/chartex" xmlns:cx4="http://schemas.microsoft.com/office/drawing/2016/5/10/chartex" xmlns:cx5="http://schemas.microsoft.com/office/drawing/2016/5/11/chartex" xmlns:cx6="http://schemas.microsoft.com/office/drawing/2016/5/12/chartex" xmlns:cx7="http://schemas.microsoft.com/office/drawing/2016/5/13/chartex" xmlns:cx8="http://schemas.microsoft.com/office/drawing/2016/5/14/chartex" xmlns:mc="http://schemas.openxmlformats.org/markup-compatibility/2006" xmlns:aink="http://schemas.microsoft.com/office/drawing/2016/ink" xmlns:am3d="http://schemas.microsoft.com/office/drawing/2017/model3d" xmlns:o="urn:schemas-microsoft-com:office:office" xmlns:oel="http://schemas.microsoft.com/office/2019/extlst" xmlns:r="http://schemas.openxmlformats.org/officeDocument/2006/relationships" xmlns:m="http://schemas.openxmlformats.org/officeDocument/2006/math" xmlns:v="urn:schemas-microsoft-com:vml" xmlns:wp14="http://schemas.microsoft.com/office/word/2010/wordprocessingDrawing" xmlns:wp="http://schemas.openxmlformats.org/drawingml/2006/wordprocessingDrawing" xmlns:w10="urn:schemas-microsoft-com:office:word" xmlns:w="http://schemas.openxmlformats.org/wordprocessingml/2006/main" xmlns:w14="http://schemas.microsoft.com/office/word/2010/wordml" xmlns:w15="http://schemas.microsoft.com/office/word/2012/wordml" xmlns:w16cex="http://schemas.microsoft.com/office/word/2018/wordml/cex" xmlns:w16cid="http://schemas.microsoft.com/office/word/2016/wordml/cid" xmlns:w16="http://schemas.microsoft.com/office/word/2018/wordml" xmlns:w16du="http://schemas.microsoft.com/office/word/2023/wordml/word16du" xmlns:w16sdtdh="http://schemas.microsoft.com/office/word/2020/wordml/sdtdatahash" xmlns:w16sdtfl="http://schemas.microsoft.com/office/word/2024/wordml/sdtformatlock" xmlns:w16se="http://schemas.microsoft.com/office/word/2015/wordml/symex" xmlns:wpg="http://schemas.microsoft.com/office/word/2010/wordprocessingGroup" xmlns:wpi="http://schemas.microsoft.com/office/word/2010/wordprocessingInk" xmlns:wne="http://schemas.microsoft.com/office/word/2006/wordml" xmlns:wps="http://schemas.microsoft.com/office/word/2010/wordprocessingShape" mc:Ignorable="w14 w15 w16se w16cid w16 w16cex w16sdtdh w16sdtfl w16du wp14">
   <w:abstractNum w:abstractNumId="0" w15:restartNumberingAfterBreak="0">
     <w:nsid w:val="030F05C0"/>
     <w:multiLevelType w:val="multilevel"/>
@@ -2663,6 +2608,7 @@
   <w:style w:type="character" w:default="1" w:styleId="DefaultParagraphFont">
     <w:name w:val="Default Paragraph Font"/>
     <w:uiPriority w:val="1"/>
+    <w:semiHidden/>
     <w:unhideWhenUsed/>
   </w:style>
   <w:style w:type="table" w:default="1" w:styleId="TableNormal">

</xml_diff>